<commit_message>
Manage the function's log group with 400-day retention
The Lambda's log group was created implicitly by Lambda, so it had no
retention and kept logs forever. The stack now creates its own log group,
/aws/lambda/<stack name>, with RetentionInDays from a new
LogRetentionInDays parameter (default 400: a year of monthly runs plus a
margin), and points the function at it via LoggingConfig (text format,
which the documented CloudWatch commands parse).

A new name is used because CloudFormation can't take over the existing
/aws/lambda/<function name> group in a normal deploy. The new group is
retained on stack deletion. Runs up to 1 Oct 2026 stay in the old group.

README, architecture-summary.html and the error-codes Word reference now
use the new log group name and mention where older runs are.

Co-Authored-By: Claude Opus 5.5 <noreply@anthropic.com>
Claude-Session: https://claude.ai/code/session_01P27tKdGGVswUWoj8wk4FXV
</commit_message>
<xml_diff>
--- a/CDR-Downloader-Error-Codes.docx
+++ b/CDR-Downloader-Error-Codes.docx
@@ -4990,6 +4990,53 @@
     </w:p>
     <w:p>
       <w:pPr>
+        <w:spacing w:after="120" w:line="276"/>
+      </w:pPr>
+      <w:r>
+        <w:rPr>
+          <w:color w:val="152227"/>
+          <w:sz w:val="19"/>
+          <w:szCs w:val="19"/>
+        </w:rPr>
+        <w:t xml:space="preserve">Logs go to </w:t>
+      </w:r>
+      <w:r>
+        <w:rPr>
+          <w:rFonts w:ascii="Consolas" w:cs="Consolas" w:eastAsia="Consolas" w:hAnsi="Consolas"/>
+          <w:color w:val="152227"/>
+          <w:sz w:val="18"/>
+          <w:szCs w:val="18"/>
+        </w:rPr>
+        <w:t xml:space="preserve">/aws/lambda/gradwell-cdr-downloader</w:t>
+      </w:r>
+      <w:r>
+        <w:rPr>
+          <w:color w:val="152227"/>
+          <w:sz w:val="19"/>
+          <w:szCs w:val="19"/>
+        </w:rPr>
+        <w:t xml:space="preserve">, kept for 400 days. Runs up to 1 Oct 2026 are in the older group </w:t>
+      </w:r>
+      <w:r>
+        <w:rPr>
+          <w:rFonts w:ascii="Consolas" w:cs="Consolas" w:eastAsia="Consolas" w:hAnsi="Consolas"/>
+          <w:color w:val="152227"/>
+          <w:sz w:val="18"/>
+          <w:szCs w:val="18"/>
+        </w:rPr>
+        <w:t xml:space="preserve">/aws/lambda/gradwell-cdr-downloader-CdrDownloaderFunction-s1GyELJsVPg5</w:t>
+      </w:r>
+      <w:r>
+        <w:rPr>
+          <w:color w:val="152227"/>
+          <w:sz w:val="19"/>
+          <w:szCs w:val="19"/>
+        </w:rPr>
+        <w:t xml:space="preserve">.</w:t>
+      </w:r>
+    </w:p>
+    <w:p>
+      <w:pPr>
         <w:pStyle w:val="Heading3"/>
         <w:spacing w:after="80" w:before="200"/>
       </w:pPr>
@@ -5026,7 +5073,7 @@
           <w:sz w:val="16"/>
           <w:szCs w:val="16"/>
         </w:rPr>
-        <w:t xml:space="preserve">  --log-group-name /aws/lambda/gradwell-cdr-downloader-CdrDownloaderFunction-s1GyELJsVPg5 \</w:t>
+        <w:t xml:space="preserve">  --log-group-name /aws/lambda/gradwell-cdr-downloader \</w:t>
       </w:r>
     </w:p>
     <w:p>
@@ -5243,7 +5290,7 @@
           <w:sz w:val="16"/>
           <w:szCs w:val="16"/>
         </w:rPr>
-        <w:t xml:space="preserve">  --log-group-name /aws/lambda/gradwell-cdr-downloader-CdrDownloaderFunction-s1GyELJsVPg5 \</w:t>
+        <w:t xml:space="preserve">  --log-group-name /aws/lambda/gradwell-cdr-downloader \</w:t>
       </w:r>
     </w:p>
     <w:p>

</xml_diff>

<commit_message>
Rename SDR_URL to CDR_URL and point it at /cdrs
The page the Lambda opens to find the download table is now set by
CDR_URL (default https://admin.prod.gradwell.com/cdrs) instead of
SDR_URL (/sdrs), in template.yaml and src/config.js (config.cdrUrl).
README, architecture-summary.html and the error-codes Word reference use
the new name and path; the CDR-E06 example keeps the /sdrs URL it was
actually observed on.

Co-Authored-By: Claude Opus 5.5 <noreply@anthropic.com>
Claude-Session: https://claude.ai/code/session_01P27tKdGGVswUWoj8wk4FXV
</commit_message>
<xml_diff>
--- a/CDR-Downloader-Error-Codes.docx
+++ b/CDR-Downloader-Error-Codes.docx
@@ -1420,7 +1420,7 @@
                 <w:sz w:val="15"/>
                 <w:szCs w:val="15"/>
               </w:rPr>
-              <w:t xml:space="preserve">&lt;timeout or network error loading /sdrs&gt;. Page URL: …</w:t>
+              <w:t xml:space="preserve">&lt;timeout or network error loading /cdrs&gt;. Page URL: …</w:t>
             </w:r>
           </w:p>
         </w:tc>
@@ -1459,7 +1459,7 @@
                 <w:sz w:val="17"/>
                 <w:szCs w:val="17"/>
               </w:rPr>
-              <w:t xml:space="preserve">SDR_URL</w:t>
+              <w:t xml:space="preserve">CDR_URL</w:t>
             </w:r>
             <w:r>
               <w:rPr>
@@ -4653,7 +4653,7 @@
                 <w:sz w:val="18"/>
                 <w:szCs w:val="18"/>
               </w:rPr>
-              <w:t xml:space="preserve">/sdrs</w:t>
+              <w:t xml:space="preserve">/cdrs</w:t>
             </w:r>
             <w:r>
               <w:rPr>

</xml_diff>

<commit_message>
Update docs for the SDR to CDR rename in error steps and messages
README, architecture-summary.html, the error-codes and Lambda config Word
docs, and the solution deck now quote the new step names ("Opening the
CDR page", "Checking the newest CDR period is published") and message
wording ("CDR table", "CDR row", "CDR period"). The Lambda config doc is
regenerated from the current source with a v1.9 version row. Real names
that still say SDR (the portal's SDR menu link, SELECTOR_SDR_OPTION,
SELECTOR_SDR_TABLE_ROW, Gradwell's SDRs_*.csv file names) are unchanged.

Co-Authored-By: Claude Opus 5.5 <noreply@anthropic.com>
Claude-Session: https://claude.ai/code/session_01P27tKdGGVswUWoj8wk4FXV
</commit_message>
<xml_diff>
--- a/CDR-Downloader-Error-Codes.docx
+++ b/CDR-Downloader-Error-Codes.docx
@@ -1326,7 +1326,7 @@
                 <w:sz w:val="19"/>
                 <w:szCs w:val="19"/>
               </w:rPr>
-              <w:t xml:space="preserve">Opening the SDR page (navigation)</w:t>
+              <w:t xml:space="preserve">Opening the CDR page (navigation)</w:t>
             </w:r>
           </w:p>
           <w:p>
@@ -1536,7 +1536,7 @@
                 <w:sz w:val="19"/>
                 <w:szCs w:val="19"/>
               </w:rPr>
-              <w:t xml:space="preserve">Opening the SDR page (table check)</w:t>
+              <w:t xml:space="preserve">Opening the CDR page (table check)</w:t>
             </w:r>
           </w:p>
           <w:p>
@@ -1646,7 +1646,7 @@
                 <w:sz w:val="15"/>
                 <w:szCs w:val="15"/>
               </w:rPr>
-              <w:t xml:space="preserve">the SDR table did not appear within 30s (no element matched "table tbody tr"). Page URL: https://admin.prod.gradwell.com/sdrs; title: "Gradwell - Admin - SDRs"; page message: "customer is required".</w:t>
+              <w:t xml:space="preserve">the CDR table did not appear within 30s (no element matched "table tbody tr"). Page URL: https://admin.prod.gradwell.com/cdrs; title: "…"; page message: "customer is required".</w:t>
             </w:r>
           </w:p>
         </w:tc>
@@ -1677,7 +1677,7 @@
                 <w:sz w:val="18"/>
                 <w:szCs w:val="18"/>
               </w:rPr>
-              <w:t xml:space="preserve">Act on the quoted page message. For "customer is required", the automation has to select a customer before the SDR table can load.</w:t>
+              <w:t xml:space="preserve">Act on the quoted page message. For "customer is required", the automation has to select a customer before the CDR table can load.</w:t>
             </w:r>
           </w:p>
         </w:tc>
@@ -1744,7 +1744,7 @@
                 <w:sz w:val="19"/>
                 <w:szCs w:val="19"/>
               </w:rPr>
-              <w:t xml:space="preserve">Checking the newest SDR period is published</w:t>
+              <w:t xml:space="preserve">Checking the newest CDR period is published</w:t>
             </w:r>
           </w:p>
           <w:p>
@@ -1838,7 +1838,7 @@
                 <w:sz w:val="15"/>
                 <w:szCs w:val="15"/>
               </w:rPr>
-              <w:t xml:space="preserve">could not find the "End Date" cell of the newest SDR row (no element matched "…" within 30s) — the SDR table layout may differ from what's expected. Page URL: …</w:t>
+              <w:t xml:space="preserve">could not find the "End Date" cell of the newest CDR row (no element matched "…" within 30s) — the CDR table layout may differ from what's expected. Page URL: …</w:t>
             </w:r>
           </w:p>
         </w:tc>
@@ -1969,7 +1969,7 @@
                 <w:sz w:val="19"/>
                 <w:szCs w:val="19"/>
               </w:rPr>
-              <w:t xml:space="preserve">Checking the newest SDR period is published</w:t>
+              <w:t xml:space="preserve">Checking the newest CDR period is published</w:t>
             </w:r>
           </w:p>
           <w:p>
@@ -2063,7 +2063,7 @@
                 <w:sz w:val="15"/>
                 <w:szCs w:val="15"/>
               </w:rPr>
-              <w:t xml:space="preserve">could not parse the newest SDR period's end date from "…" — the SDR table format may have changed.</w:t>
+              <w:t xml:space="preserve">could not parse the newest CDR period's end date from "…" — the CDR table format may have changed.</w:t>
             </w:r>
           </w:p>
         </w:tc>
@@ -2160,7 +2160,7 @@
                 <w:sz w:val="19"/>
                 <w:szCs w:val="19"/>
               </w:rPr>
-              <w:t xml:space="preserve">Checking the newest SDR period is published</w:t>
+              <w:t xml:space="preserve">Checking the newest CDR period is published</w:t>
             </w:r>
           </w:p>
           <w:p>
@@ -2254,7 +2254,7 @@
                 <w:sz w:val="15"/>
                 <w:szCs w:val="15"/>
               </w:rPr>
-              <w:t xml:space="preserve">new CDR record not yet available: expected the newest SDR period to end &lt;YYYY-MM-DD&gt; (last day of the previous month), but the newest row on the page ends &lt;YYYY-MM-DD&gt; ("…"). Gradwell likely hasn't published this month's CDR yet.</w:t>
+              <w:t xml:space="preserve">new CDR record not yet available: expected the newest CDR period to end &lt;YYYY-MM-DD&gt; (last day of the previous month), but the newest row on the page ends &lt;YYYY-MM-DD&gt; ("…"). Gradwell likely hasn't published this month's CDR yet.</w:t>
             </w:r>
           </w:p>
         </w:tc>
@@ -3823,7 +3823,7 @@
                 <w:sz w:val="18"/>
                 <w:szCs w:val="18"/>
               </w:rPr>
-              <w:t xml:space="preserve">Opening the SDR page</w:t>
+              <w:t xml:space="preserve">Opening the CDR page</w:t>
             </w:r>
           </w:p>
         </w:tc>
@@ -3915,7 +3915,7 @@
                 <w:sz w:val="18"/>
                 <w:szCs w:val="18"/>
               </w:rPr>
-              <w:t xml:space="preserve">[CDR-E06] Opening the SDR page failed: … "customer is required".</w:t>
+              <w:t xml:space="preserve">[CDR-E06] Opening the CDR page failed: … "customer is required".</w:t>
             </w:r>
           </w:p>
         </w:tc>

</xml_diff>

<commit_message>
Document the monitoring dashboard, custom metrics and new alarms
- README: monitoring dashboard and alarms, delivery-check invoke, the
  size in the success log line and response, and the two new IAM
  permissions.
- architecture-summary.html: failures counted by code, delivery-check and
  alarms facts, and all three alarms in the Datadog note.
- CdrDownloaderFunction-Lambda-Config.docx: regenerated with v1.10, a
  monitoring section (schedule and alarm resources), the IAM update and
  src/metrics.js.
- CDR-Downloader-Error-Codes.docx: failures counted by code, and the
  CDR_DELIVERY_CHECK, "Failed to publish metric" and updated success log
  lines.

Co-Authored-By: Claude Opus 5.5 <noreply@anthropic.com>
Claude-Session: https://claude.ai/code/session_01P27tKdGGVswUWoj8wk4FXV
</commit_message>
<xml_diff>
--- a/CDR-Downloader-Error-Codes.docx
+++ b/CDR-Downloader-Error-Codes.docx
@@ -3199,6 +3199,58 @@
           <w:sz w:val="19"/>
           <w:szCs w:val="19"/>
         </w:rPr>
+        <w:t xml:space="preserve">Is counted by code: publishes </w:t>
+      </w:r>
+      <w:r>
+        <w:rPr>
+          <w:rFonts w:ascii="Consolas" w:cs="Consolas" w:eastAsia="Consolas" w:hAnsi="Consolas"/>
+          <w:color w:val="152227"/>
+          <w:sz w:val="18"/>
+          <w:szCs w:val="18"/>
+        </w:rPr>
+        <w:t xml:space="preserve">CdrDownloader</w:t>
+      </w:r>
+      <w:r>
+        <w:rPr>
+          <w:color w:val="152227"/>
+          <w:sz w:val="19"/>
+          <w:szCs w:val="19"/>
+        </w:rPr>
+        <w:t xml:space="preserve"> / </w:t>
+      </w:r>
+      <w:r>
+        <w:rPr>
+          <w:rFonts w:ascii="Consolas" w:cs="Consolas" w:eastAsia="Consolas" w:hAnsi="Consolas"/>
+          <w:color w:val="152227"/>
+          <w:sz w:val="18"/>
+          <w:szCs w:val="18"/>
+        </w:rPr>
+        <w:t xml:space="preserve">Failures</w:t>
+      </w:r>
+      <w:r>
+        <w:rPr>
+          <w:color w:val="152227"/>
+          <w:sz w:val="19"/>
+          <w:szCs w:val="19"/>
+        </w:rPr>
+        <w:t xml:space="preserve"> with the error code as a dimension, shown on the monitoring dashboard.</w:t>
+      </w:r>
+    </w:p>
+    <w:p>
+      <w:pPr>
+        <w:pStyle w:val="ListParagraph"/>
+        <w:numPr>
+          <w:ilvl w:val="0"/>
+          <w:numId w:val="2"/>
+        </w:numPr>
+        <w:spacing w:after="40"/>
+      </w:pPr>
+      <w:r>
+        <w:rPr>
+          <w:color w:val="152227"/>
+          <w:sz w:val="19"/>
+          <w:szCs w:val="19"/>
+        </w:rPr>
         <w:t xml:space="preserve">Raises the alarm: adds 1 to the Lambda </w:t>
       </w:r>
       <w:r>
@@ -4442,7 +4494,7 @@
                 <w:sz w:val="17"/>
                 <w:szCs w:val="17"/>
               </w:rPr>
-              <w:t xml:space="preserve">CDR file uploaded to s3://… in &lt;ms&gt;ms</w:t>
+              <w:t xml:space="preserve">CDR file uploaded to s3://… (&lt;n&gt; bytes) in &lt;ms&gt;ms</w:t>
             </w:r>
           </w:p>
         </w:tc>
@@ -4504,7 +4556,195 @@
                 <w:sz w:val="19"/>
                 <w:szCs w:val="19"/>
               </w:rPr>
-              <w:t xml:space="preserve">The run succeeded.</w:t>
+              <w:t xml:space="preserve">The run succeeded. The size is also published as the FileSizeBytes metric.</w:t>
+            </w:r>
+          </w:p>
+        </w:tc>
+      </w:tr>
+      <w:tr>
+        <w:trPr>
+          <w:cantSplit/>
+        </w:trPr>
+        <w:tc>
+          <w:tcPr>
+            <w:tcW w:type="dxa" w:w="6400"/>
+            <w:tcBorders>
+              <w:top w:val="single" w:color="C9D6D3" w:sz="4"/>
+              <w:left w:val="single" w:color="C9D6D3" w:sz="4"/>
+              <w:bottom w:val="single" w:color="C9D6D3" w:sz="4"/>
+              <w:right w:val="single" w:color="C9D6D3" w:sz="4"/>
+            </w:tcBorders>
+            <w:tcMar>
+              <w:top w:type="dxa" w:w="80"/>
+              <w:left w:type="dxa" w:w="100"/>
+              <w:bottom w:type="dxa" w:w="80"/>
+              <w:right w:type="dxa" w:w="100"/>
+            </w:tcMar>
+          </w:tcPr>
+          <w:p>
+            <w:r>
+              <w:rPr>
+                <w:rFonts w:ascii="Consolas" w:cs="Consolas" w:eastAsia="Consolas" w:hAnsi="Consolas"/>
+                <w:sz w:val="17"/>
+                <w:szCs w:val="17"/>
+              </w:rPr>
+              <w:t xml:space="preserve">CDR_DELIVERY_CHECK {…"ok":true|false}</w:t>
+            </w:r>
+          </w:p>
+        </w:tc>
+        <w:tc>
+          <w:tcPr>
+            <w:tcW w:type="dxa" w:w="1100"/>
+            <w:tcBorders>
+              <w:top w:val="single" w:color="C9D6D3" w:sz="4"/>
+              <w:left w:val="single" w:color="C9D6D3" w:sz="4"/>
+              <w:bottom w:val="single" w:color="C9D6D3" w:sz="4"/>
+              <w:right w:val="single" w:color="C9D6D3" w:sz="4"/>
+            </w:tcBorders>
+            <w:tcMar>
+              <w:top w:type="dxa" w:w="80"/>
+              <w:left w:type="dxa" w:w="100"/>
+              <w:bottom w:type="dxa" w:w="80"/>
+              <w:right w:type="dxa" w:w="100"/>
+            </w:tcMar>
+          </w:tcPr>
+          <w:p>
+            <w:pPr>
+              <w:spacing w:after="0" w:line="276"/>
+            </w:pPr>
+            <w:r>
+              <w:rPr>
+                <w:b/>
+                <w:bCs/>
+                <w:color w:val="152227"/>
+                <w:sz w:val="18"/>
+                <w:szCs w:val="18"/>
+              </w:rPr>
+              <w:t xml:space="preserve">INFO</w:t>
+            </w:r>
+          </w:p>
+        </w:tc>
+        <w:tc>
+          <w:tcPr>
+            <w:tcW w:type="dxa" w:w="7898"/>
+            <w:tcBorders>
+              <w:top w:val="single" w:color="C9D6D3" w:sz="4"/>
+              <w:left w:val="single" w:color="C9D6D3" w:sz="4"/>
+              <w:bottom w:val="single" w:color="C9D6D3" w:sz="4"/>
+              <w:right w:val="single" w:color="C9D6D3" w:sz="4"/>
+            </w:tcBorders>
+            <w:tcMar>
+              <w:top w:type="dxa" w:w="80"/>
+              <w:left w:type="dxa" w:w="100"/>
+              <w:bottom w:type="dxa" w:w="80"/>
+              <w:right w:type="dxa" w:w="100"/>
+            </w:tcMar>
+          </w:tcPr>
+          <w:p>
+            <w:pPr>
+              <w:spacing w:after="0" w:line="276"/>
+            </w:pPr>
+            <w:r>
+              <w:rPr>
+                <w:color w:val="152227"/>
+                <w:sz w:val="19"/>
+                <w:szCs w:val="19"/>
+              </w:rPr>
+              <w:t xml:space="preserve">The 10:30 delivery check on the 1st. ok:false means no file of at least 1 KB, and the delivery-missing alarm fires.</w:t>
+            </w:r>
+          </w:p>
+        </w:tc>
+      </w:tr>
+      <w:tr>
+        <w:trPr>
+          <w:cantSplit/>
+        </w:trPr>
+        <w:tc>
+          <w:tcPr>
+            <w:tcW w:type="dxa" w:w="6400"/>
+            <w:tcBorders>
+              <w:top w:val="single" w:color="C9D6D3" w:sz="4"/>
+              <w:left w:val="single" w:color="C9D6D3" w:sz="4"/>
+              <w:bottom w:val="single" w:color="C9D6D3" w:sz="4"/>
+              <w:right w:val="single" w:color="C9D6D3" w:sz="4"/>
+            </w:tcBorders>
+            <w:tcMar>
+              <w:top w:type="dxa" w:w="80"/>
+              <w:left w:type="dxa" w:w="100"/>
+              <w:bottom w:type="dxa" w:w="80"/>
+              <w:right w:type="dxa" w:w="100"/>
+            </w:tcMar>
+          </w:tcPr>
+          <w:p>
+            <w:r>
+              <w:rPr>
+                <w:rFonts w:ascii="Consolas" w:cs="Consolas" w:eastAsia="Consolas" w:hAnsi="Consolas"/>
+                <w:sz w:val="17"/>
+                <w:szCs w:val="17"/>
+              </w:rPr>
+              <w:t xml:space="preserve">Failed to publish metric CdrDownloader/…</w:t>
+            </w:r>
+          </w:p>
+        </w:tc>
+        <w:tc>
+          <w:tcPr>
+            <w:tcW w:type="dxa" w:w="1100"/>
+            <w:tcBorders>
+              <w:top w:val="single" w:color="C9D6D3" w:sz="4"/>
+              <w:left w:val="single" w:color="C9D6D3" w:sz="4"/>
+              <w:bottom w:val="single" w:color="C9D6D3" w:sz="4"/>
+              <w:right w:val="single" w:color="C9D6D3" w:sz="4"/>
+            </w:tcBorders>
+            <w:tcMar>
+              <w:top w:type="dxa" w:w="80"/>
+              <w:left w:type="dxa" w:w="100"/>
+              <w:bottom w:type="dxa" w:w="80"/>
+              <w:right w:type="dxa" w:w="100"/>
+            </w:tcMar>
+          </w:tcPr>
+          <w:p>
+            <w:pPr>
+              <w:spacing w:after="0" w:line="276"/>
+            </w:pPr>
+            <w:r>
+              <w:rPr>
+                <w:b/>
+                <w:bCs/>
+                <w:color w:val="152227"/>
+                <w:sz w:val="18"/>
+                <w:szCs w:val="18"/>
+              </w:rPr>
+              <w:t xml:space="preserve">ERROR</w:t>
+            </w:r>
+          </w:p>
+        </w:tc>
+        <w:tc>
+          <w:tcPr>
+            <w:tcW w:type="dxa" w:w="7898"/>
+            <w:tcBorders>
+              <w:top w:val="single" w:color="C9D6D3" w:sz="4"/>
+              <w:left w:val="single" w:color="C9D6D3" w:sz="4"/>
+              <w:bottom w:val="single" w:color="C9D6D3" w:sz="4"/>
+              <w:right w:val="single" w:color="C9D6D3" w:sz="4"/>
+            </w:tcBorders>
+            <w:tcMar>
+              <w:top w:type="dxa" w:w="80"/>
+              <w:left w:type="dxa" w:w="100"/>
+              <w:bottom w:type="dxa" w:w="80"/>
+              <w:right w:type="dxa" w:w="100"/>
+            </w:tcMar>
+          </w:tcPr>
+          <w:p>
+            <w:pPr>
+              <w:spacing w:after="0" w:line="276"/>
+            </w:pPr>
+            <w:r>
+              <w:rPr>
+                <w:color w:val="152227"/>
+                <w:sz w:val="19"/>
+                <w:szCs w:val="19"/>
+              </w:rPr>
+              <w:t xml:space="preserve">A monitoring metric couldn't be sent. The run itself is unaffected.</w:t>
             </w:r>
           </w:p>
         </w:tc>

</xml_diff>